<commit_message>
Board.py QA Test Cont.
</commit_message>
<xml_diff>
--- a/docs/Artifacts/Testing/EECS581 Minesweeper Board.py Test Cases.docx
+++ b/docs/Artifacts/Testing/EECS581 Minesweeper Board.py Test Cases.docx
@@ -14,29 +14,8 @@
       <w:pPr>
         <w:pStyle w:val="Heading2"/>
       </w:pPr>
-      <w:proofErr w:type="spellStart"/>
-      <w:r>
-        <w:t>populateBoard</w:t>
-      </w:r>
-      <w:proofErr w:type="spellEnd"/>
-      <w:r>
-        <w:t>(</w:t>
-      </w:r>
-      <w:proofErr w:type="spellStart"/>
-      <w:r>
-        <w:t>clickedCellRow</w:t>
-      </w:r>
-      <w:proofErr w:type="spellEnd"/>
-      <w:r>
-        <w:t xml:space="preserve">: int, </w:t>
-      </w:r>
-      <w:proofErr w:type="spellStart"/>
-      <w:r>
-        <w:t>clickedCellCol</w:t>
-      </w:r>
-      <w:proofErr w:type="spellEnd"/>
-      <w:r>
-        <w:t>: int)</w:t>
+      <w:r>
+        <w:t>populateBoard(clickedCellRow: int, clickedCellCol: int)</w:t>
       </w:r>
     </w:p>
     <w:p>
@@ -103,47 +82,13 @@
           <w:szCs w:val="28"/>
         </w:rPr>
       </w:pPr>
-      <w:proofErr w:type="spellStart"/>
-      <w:r>
-        <w:rPr>
-          <w:sz w:val="28"/>
-          <w:szCs w:val="28"/>
-        </w:rPr>
-        <w:t>rowMine</w:t>
-      </w:r>
-      <w:proofErr w:type="spellEnd"/>
-      <w:r>
-        <w:rPr>
-          <w:sz w:val="28"/>
-          <w:szCs w:val="28"/>
-        </w:rPr>
-        <w:t xml:space="preserve"> == </w:t>
-      </w:r>
-      <w:proofErr w:type="spellStart"/>
-      <w:r>
-        <w:rPr>
-          <w:sz w:val="28"/>
-          <w:szCs w:val="28"/>
-        </w:rPr>
-        <w:t>clickedCellRow</w:t>
-      </w:r>
-      <w:proofErr w:type="spellEnd"/>
-      <w:r>
-        <w:rPr>
-          <w:sz w:val="28"/>
-          <w:szCs w:val="28"/>
-        </w:rPr>
-        <w:t xml:space="preserve"> and coalmine == </w:t>
-      </w:r>
-      <w:proofErr w:type="spellStart"/>
-      <w:r>
-        <w:rPr>
-          <w:sz w:val="28"/>
-          <w:szCs w:val="28"/>
-        </w:rPr>
-        <w:t>clickedCellCol</w:t>
-      </w:r>
-      <w:proofErr w:type="spellEnd"/>
+      <w:r>
+        <w:rPr>
+          <w:sz w:val="28"/>
+          <w:szCs w:val="28"/>
+        </w:rPr>
+        <w:t>rowMine == clickedCellRow and coalmine == clickedCellCol</w:t>
+      </w:r>
     </w:p>
     <w:p>
       <w:pPr>
@@ -251,53 +196,12 @@
           <w:szCs w:val="28"/>
         </w:rPr>
       </w:pPr>
-      <w:proofErr w:type="spellStart"/>
-      <w:r>
-        <w:rPr>
-          <w:sz w:val="28"/>
-          <w:szCs w:val="28"/>
-        </w:rPr>
-        <w:t>self.getCellState</w:t>
-      </w:r>
-      <w:proofErr w:type="spellEnd"/>
-      <w:r>
-        <w:rPr>
-          <w:sz w:val="28"/>
-          <w:szCs w:val="28"/>
-        </w:rPr>
-        <w:t>(</w:t>
-      </w:r>
-      <w:proofErr w:type="spellStart"/>
-      <w:r>
-        <w:rPr>
-          <w:sz w:val="28"/>
-          <w:szCs w:val="28"/>
-        </w:rPr>
-        <w:t>clickedCellRow</w:t>
-      </w:r>
-      <w:proofErr w:type="spellEnd"/>
-      <w:r>
-        <w:rPr>
-          <w:sz w:val="28"/>
-          <w:szCs w:val="28"/>
-        </w:rPr>
-        <w:t xml:space="preserve">, </w:t>
-      </w:r>
-      <w:proofErr w:type="spellStart"/>
-      <w:r>
-        <w:rPr>
-          <w:sz w:val="28"/>
-          <w:szCs w:val="28"/>
-        </w:rPr>
-        <w:t>clickedCellCol</w:t>
-      </w:r>
-      <w:proofErr w:type="spellEnd"/>
-      <w:r>
-        <w:rPr>
-          <w:sz w:val="28"/>
-          <w:szCs w:val="28"/>
-        </w:rPr>
-        <w:t>) == 3</w:t>
+      <w:r>
+        <w:rPr>
+          <w:sz w:val="28"/>
+          <w:szCs w:val="28"/>
+        </w:rPr>
+        <w:t>self.getCellState(clickedCellRow, clickedCellCol) == 3</w:t>
       </w:r>
     </w:p>
     <w:p>
@@ -387,38 +291,9 @@
       <w:pPr>
         <w:pStyle w:val="Heading2"/>
       </w:pPr>
-      <w:proofErr w:type="spellStart"/>
       <w:r>
         <w:lastRenderedPageBreak/>
-        <w:t>setState</w:t>
-      </w:r>
-      <w:proofErr w:type="spellEnd"/>
-      <w:r>
-        <w:t xml:space="preserve">(self, </w:t>
-      </w:r>
-      <w:proofErr w:type="spellStart"/>
-      <w:r>
-        <w:t>clickedCellRow</w:t>
-      </w:r>
-      <w:proofErr w:type="spellEnd"/>
-      <w:r>
-        <w:t xml:space="preserve">: int, </w:t>
-      </w:r>
-      <w:proofErr w:type="spellStart"/>
-      <w:r>
-        <w:t>clickedCelCol</w:t>
-      </w:r>
-      <w:proofErr w:type="spellEnd"/>
-      <w:r>
-        <w:t xml:space="preserve">: int, </w:t>
-      </w:r>
-      <w:proofErr w:type="spellStart"/>
-      <w:r>
-        <w:t>isFlagging</w:t>
-      </w:r>
-      <w:proofErr w:type="spellEnd"/>
-      <w:r>
-        <w:t>: bool = False)</w:t>
+        <w:t>setState(self, clickedCellRow: int, clickedCelCol: int, isFlagging: bool = False)</w:t>
       </w:r>
     </w:p>
     <w:p>
@@ -570,14 +445,7 @@
           <w:sz w:val="28"/>
           <w:szCs w:val="28"/>
         </w:rPr>
-        <w:t xml:space="preserve"> </w:t>
-      </w:r>
-      <w:r>
-        <w:rPr>
-          <w:sz w:val="28"/>
-          <w:szCs w:val="28"/>
-        </w:rPr>
-        <w:t>Same as expected behavior</w:t>
+        <w:t xml:space="preserve"> Same as expected behavior</w:t>
       </w:r>
     </w:p>
     <w:p>
@@ -664,14 +532,7 @@
           <w:sz w:val="28"/>
           <w:szCs w:val="28"/>
         </w:rPr>
-        <w:t xml:space="preserve"> </w:t>
-      </w:r>
-      <w:r>
-        <w:rPr>
-          <w:sz w:val="28"/>
-          <w:szCs w:val="28"/>
-        </w:rPr>
-        <w:t>Same as expected behavior</w:t>
+        <w:t xml:space="preserve"> Same as expected behavior</w:t>
       </w:r>
     </w:p>
     <w:p>
@@ -758,14 +619,7 @@
           <w:sz w:val="28"/>
           <w:szCs w:val="28"/>
         </w:rPr>
-        <w:t xml:space="preserve"> </w:t>
-      </w:r>
-      <w:r>
-        <w:rPr>
-          <w:sz w:val="28"/>
-          <w:szCs w:val="28"/>
-        </w:rPr>
-        <w:t>Same as expected behavior</w:t>
+        <w:t xml:space="preserve"> Same as expected behavior</w:t>
       </w:r>
     </w:p>
     <w:p>
@@ -852,14 +706,7 @@
           <w:sz w:val="28"/>
           <w:szCs w:val="28"/>
         </w:rPr>
-        <w:t xml:space="preserve"> </w:t>
-      </w:r>
-      <w:r>
-        <w:rPr>
-          <w:sz w:val="28"/>
-          <w:szCs w:val="28"/>
-        </w:rPr>
-        <w:t>Same as expected behavior</w:t>
+        <w:t xml:space="preserve"> Same as expected behavior</w:t>
       </w:r>
     </w:p>
     <w:p>
@@ -914,21 +761,12 @@
           <w:szCs w:val="28"/>
         </w:rPr>
       </w:pPr>
-      <w:proofErr w:type="spellStart"/>
-      <w:r>
-        <w:rPr>
-          <w:sz w:val="28"/>
-          <w:szCs w:val="28"/>
-        </w:rPr>
-        <w:t>gameState</w:t>
-      </w:r>
-      <w:proofErr w:type="spellEnd"/>
-      <w:r>
-        <w:rPr>
-          <w:sz w:val="28"/>
-          <w:szCs w:val="28"/>
-        </w:rPr>
-        <w:t xml:space="preserve"> is updated to be set to -1, indicative of a game over and thus soon-to-be end of program.</w:t>
+      <w:r>
+        <w:rPr>
+          <w:sz w:val="28"/>
+          <w:szCs w:val="28"/>
+        </w:rPr>
+        <w:t>gameState is updated to be set to -1, indicative of a game over and thus soon-to-be end of program.</w:t>
       </w:r>
     </w:p>
     <w:p>
@@ -955,14 +793,7 @@
           <w:sz w:val="28"/>
           <w:szCs w:val="28"/>
         </w:rPr>
-        <w:t xml:space="preserve"> </w:t>
-      </w:r>
-      <w:r>
-        <w:rPr>
-          <w:sz w:val="28"/>
-          <w:szCs w:val="28"/>
-        </w:rPr>
-        <w:t>Same as expected behavior</w:t>
+        <w:t xml:space="preserve"> Same as expected behavior</w:t>
       </w:r>
     </w:p>
     <w:p>
@@ -1017,22 +848,13 @@
           <w:szCs w:val="28"/>
         </w:rPr>
       </w:pPr>
-      <w:proofErr w:type="spellStart"/>
       <w:r>
         <w:rPr>
           <w:sz w:val="28"/>
           <w:szCs w:val="28"/>
         </w:rPr>
         <w:lastRenderedPageBreak/>
-        <w:t>numBombNeighbors</w:t>
-      </w:r>
-      <w:proofErr w:type="spellEnd"/>
-      <w:r>
-        <w:rPr>
-          <w:sz w:val="28"/>
-          <w:szCs w:val="28"/>
-        </w:rPr>
-        <w:t xml:space="preserve"> is called with the cell’s row and column as parameters, the return value is obtained.</w:t>
+        <w:t>numBombNeighbors is called with the cell’s row and column as parameters, the return value is obtained.</w:t>
       </w:r>
     </w:p>
     <w:p>
@@ -1059,23 +881,7 @@
           <w:sz w:val="28"/>
           <w:szCs w:val="28"/>
         </w:rPr>
-        <w:t xml:space="preserve">all neighboring cells that have a value of 0 should be cleared by a nested for loop of </w:t>
-      </w:r>
-      <w:proofErr w:type="spellStart"/>
-      <w:r>
-        <w:rPr>
-          <w:sz w:val="28"/>
-          <w:szCs w:val="28"/>
-        </w:rPr>
-        <w:t>setState</w:t>
-      </w:r>
-      <w:proofErr w:type="spellEnd"/>
-      <w:r>
-        <w:rPr>
-          <w:sz w:val="28"/>
-          <w:szCs w:val="28"/>
-        </w:rPr>
-        <w:t>() calls</w:t>
+        <w:t>all neighboring cells that have a value of 0 should be cleared by a nested for loop of setState() calls</w:t>
       </w:r>
     </w:p>
     <w:p>
@@ -1102,14 +908,7 @@
           <w:sz w:val="28"/>
           <w:szCs w:val="28"/>
         </w:rPr>
-        <w:t xml:space="preserve"> </w:t>
-      </w:r>
-      <w:r>
-        <w:rPr>
-          <w:sz w:val="28"/>
-          <w:szCs w:val="28"/>
-        </w:rPr>
-        <w:t>Same as expected behavior</w:t>
+        <w:t xml:space="preserve"> Same as expected behavior</w:t>
       </w:r>
     </w:p>
     <w:p>
@@ -1125,15 +924,7 @@
         <w:pStyle w:val="Heading2"/>
       </w:pPr>
       <w:r>
-        <w:t>__</w:t>
-      </w:r>
-      <w:proofErr w:type="spellStart"/>
-      <w:r>
-        <w:t>checkAdjCells</w:t>
-      </w:r>
-      <w:proofErr w:type="spellEnd"/>
-      <w:r>
-        <w:t>(self, row: int, col: int):</w:t>
+        <w:t>__checkAdjCells(self, row: int, col: int):</w:t>
       </w:r>
     </w:p>
     <w:p>
@@ -1231,23 +1022,7 @@
           <w:sz w:val="28"/>
           <w:szCs w:val="28"/>
         </w:rPr>
-        <w:t xml:space="preserve">Calls </w:t>
-      </w:r>
-      <w:proofErr w:type="spellStart"/>
-      <w:r>
-        <w:rPr>
-          <w:sz w:val="28"/>
-          <w:szCs w:val="28"/>
-        </w:rPr>
-        <w:t>getCellState</w:t>
-      </w:r>
-      <w:proofErr w:type="spellEnd"/>
-      <w:r>
-        <w:rPr>
-          <w:sz w:val="28"/>
-          <w:szCs w:val="28"/>
-        </w:rPr>
-        <w:t>() on all of the found cells adjacent</w:t>
+        <w:t>Calls getCellState() on all of the found cells adjacent</w:t>
       </w:r>
     </w:p>
     <w:p>
@@ -1268,6 +1043,13 @@
           <w:szCs w:val="28"/>
         </w:rPr>
         <w:t>Observed Behavior:</w:t>
+      </w:r>
+      <w:r>
+        <w:rPr>
+          <w:sz w:val="28"/>
+          <w:szCs w:val="28"/>
+        </w:rPr>
+        <w:t xml:space="preserve"> Same as expected behavior</w:t>
       </w:r>
     </w:p>
     <w:p>
@@ -1327,23 +1109,7 @@
           <w:sz w:val="28"/>
           <w:szCs w:val="28"/>
         </w:rPr>
-        <w:t xml:space="preserve">Calls </w:t>
-      </w:r>
-      <w:proofErr w:type="spellStart"/>
-      <w:r>
-        <w:rPr>
-          <w:sz w:val="28"/>
-          <w:szCs w:val="28"/>
-        </w:rPr>
-        <w:t>getCellState</w:t>
-      </w:r>
-      <w:proofErr w:type="spellEnd"/>
-      <w:r>
-        <w:rPr>
-          <w:sz w:val="28"/>
-          <w:szCs w:val="28"/>
-        </w:rPr>
-        <w:t>() on all of the found cells adjacent</w:t>
+        <w:t>Calls getCellState() on all of the found cells adjacent</w:t>
       </w:r>
     </w:p>
     <w:p>
@@ -1364,6 +1130,13 @@
           <w:szCs w:val="28"/>
         </w:rPr>
         <w:t>Observed Behavior:</w:t>
+      </w:r>
+      <w:r>
+        <w:rPr>
+          <w:sz w:val="28"/>
+          <w:szCs w:val="28"/>
+        </w:rPr>
+        <w:t xml:space="preserve"> Same as expected behavior</w:t>
       </w:r>
     </w:p>
     <w:p>
@@ -1423,23 +1196,7 @@
           <w:sz w:val="28"/>
           <w:szCs w:val="28"/>
         </w:rPr>
-        <w:t xml:space="preserve">Calls </w:t>
-      </w:r>
-      <w:proofErr w:type="spellStart"/>
-      <w:r>
-        <w:rPr>
-          <w:sz w:val="28"/>
-          <w:szCs w:val="28"/>
-        </w:rPr>
-        <w:t>getCellState</w:t>
-      </w:r>
-      <w:proofErr w:type="spellEnd"/>
-      <w:r>
-        <w:rPr>
-          <w:sz w:val="28"/>
-          <w:szCs w:val="28"/>
-        </w:rPr>
-        <w:t>() on all of the found cells adjacent</w:t>
+        <w:t>Calls getCellState() on all of the found cells adjacent</w:t>
       </w:r>
     </w:p>
     <w:p>
@@ -1460,6 +1217,13 @@
           <w:szCs w:val="28"/>
         </w:rPr>
         <w:t>Observed Behavior:</w:t>
+      </w:r>
+      <w:r>
+        <w:rPr>
+          <w:sz w:val="28"/>
+          <w:szCs w:val="28"/>
+        </w:rPr>
+        <w:t xml:space="preserve"> Same as expected behavior</w:t>
       </w:r>
     </w:p>
     <w:p>
@@ -1519,23 +1283,7 @@
           <w:sz w:val="28"/>
           <w:szCs w:val="28"/>
         </w:rPr>
-        <w:t xml:space="preserve">Calls </w:t>
-      </w:r>
-      <w:proofErr w:type="spellStart"/>
-      <w:r>
-        <w:rPr>
-          <w:sz w:val="28"/>
-          <w:szCs w:val="28"/>
-        </w:rPr>
-        <w:t>getCellState</w:t>
-      </w:r>
-      <w:proofErr w:type="spellEnd"/>
-      <w:r>
-        <w:rPr>
-          <w:sz w:val="28"/>
-          <w:szCs w:val="28"/>
-        </w:rPr>
-        <w:t>() on all of the found cells adjacent</w:t>
+        <w:t>Calls getCellState() on all of the found cells adja</w:t>
       </w:r>
     </w:p>
     <w:p>
@@ -1555,7 +1303,555 @@
           <w:sz w:val="28"/>
           <w:szCs w:val="28"/>
         </w:rPr>
+        <w:t>cent</w:t>
+      </w:r>
+    </w:p>
+    <w:p>
+      <w:pPr>
+        <w:pStyle w:val="ListParagraph"/>
+        <w:numPr>
+          <w:ilvl w:val="1"/>
+          <w:numId w:val="4"/>
+        </w:numPr>
+        <w:rPr>
+          <w:sz w:val="28"/>
+          <w:szCs w:val="28"/>
+        </w:rPr>
+      </w:pPr>
+      <w:r>
+        <w:rPr>
+          <w:sz w:val="28"/>
+          <w:szCs w:val="28"/>
+        </w:rPr>
         <w:t>Observed Behavior:</w:t>
+      </w:r>
+      <w:r>
+        <w:rPr>
+          <w:sz w:val="28"/>
+          <w:szCs w:val="28"/>
+        </w:rPr>
+        <w:t xml:space="preserve"> Same as expected behavior</w:t>
+      </w:r>
+    </w:p>
+    <w:p>
+      <w:pPr>
+        <w:pStyle w:val="Heading2"/>
+      </w:pPr>
+      <w:r>
+        <w:lastRenderedPageBreak/>
+        <w:t>get_input</w:t>
+      </w:r>
+      <w:r>
+        <w:t>()</w:t>
+      </w:r>
+    </w:p>
+    <w:p>
+      <w:pPr>
+        <w:rPr>
+          <w:sz w:val="28"/>
+          <w:szCs w:val="28"/>
+        </w:rPr>
+      </w:pPr>
+      <w:r>
+        <w:rPr>
+          <w:sz w:val="28"/>
+          <w:szCs w:val="28"/>
+        </w:rPr>
+        <w:t>Goal: to handle user input in order to modify cells that the user specifies</w:t>
+      </w:r>
+    </w:p>
+    <w:p>
+      <w:pPr>
+        <w:rPr>
+          <w:sz w:val="28"/>
+          <w:szCs w:val="28"/>
+        </w:rPr>
+      </w:pPr>
+      <w:r>
+        <w:rPr>
+          <w:sz w:val="28"/>
+          <w:szCs w:val="28"/>
+        </w:rPr>
+        <w:t>Possible Cases and Observed Behavior:</w:t>
+      </w:r>
+    </w:p>
+    <w:p>
+      <w:pPr>
+        <w:pStyle w:val="ListParagraph"/>
+        <w:numPr>
+          <w:ilvl w:val="0"/>
+          <w:numId w:val="4"/>
+        </w:numPr>
+        <w:rPr>
+          <w:sz w:val="28"/>
+          <w:szCs w:val="28"/>
+        </w:rPr>
+      </w:pPr>
+      <w:r>
+        <w:rPr>
+          <w:sz w:val="28"/>
+          <w:szCs w:val="28"/>
+        </w:rPr>
+        <w:t>Input a cell without column name</w:t>
+      </w:r>
+    </w:p>
+    <w:p>
+      <w:pPr>
+        <w:pStyle w:val="ListParagraph"/>
+        <w:numPr>
+          <w:ilvl w:val="1"/>
+          <w:numId w:val="4"/>
+        </w:numPr>
+        <w:rPr>
+          <w:sz w:val="28"/>
+          <w:szCs w:val="28"/>
+        </w:rPr>
+      </w:pPr>
+      <w:r>
+        <w:rPr>
+          <w:sz w:val="28"/>
+          <w:szCs w:val="28"/>
+        </w:rPr>
+        <w:t>Game does not allow this</w:t>
+      </w:r>
+      <w:r>
+        <w:rPr>
+          <w:sz w:val="28"/>
+          <w:szCs w:val="28"/>
+        </w:rPr>
+        <w:t>, outputs error,</w:t>
+      </w:r>
+      <w:r>
+        <w:rPr>
+          <w:sz w:val="28"/>
+          <w:szCs w:val="28"/>
+        </w:rPr>
+        <w:t xml:space="preserve"> and requests another input</w:t>
+      </w:r>
+    </w:p>
+    <w:p>
+      <w:pPr>
+        <w:pStyle w:val="ListParagraph"/>
+        <w:numPr>
+          <w:ilvl w:val="1"/>
+          <w:numId w:val="4"/>
+        </w:numPr>
+        <w:rPr>
+          <w:sz w:val="28"/>
+          <w:szCs w:val="28"/>
+        </w:rPr>
+      </w:pPr>
+      <w:r>
+        <w:rPr>
+          <w:sz w:val="28"/>
+          <w:szCs w:val="28"/>
+        </w:rPr>
+        <w:t>Observed Behavior: Same as expected behavior</w:t>
+      </w:r>
+    </w:p>
+    <w:p>
+      <w:pPr>
+        <w:pStyle w:val="ListParagraph"/>
+        <w:numPr>
+          <w:ilvl w:val="0"/>
+          <w:numId w:val="4"/>
+        </w:numPr>
+        <w:rPr>
+          <w:sz w:val="28"/>
+          <w:szCs w:val="28"/>
+        </w:rPr>
+      </w:pPr>
+      <w:r>
+        <w:rPr>
+          <w:sz w:val="28"/>
+          <w:szCs w:val="28"/>
+        </w:rPr>
+        <w:t>Input a cell without row number</w:t>
+      </w:r>
+    </w:p>
+    <w:p>
+      <w:pPr>
+        <w:pStyle w:val="ListParagraph"/>
+        <w:numPr>
+          <w:ilvl w:val="1"/>
+          <w:numId w:val="4"/>
+        </w:numPr>
+        <w:rPr>
+          <w:sz w:val="28"/>
+          <w:szCs w:val="28"/>
+        </w:rPr>
+      </w:pPr>
+      <w:r>
+        <w:rPr>
+          <w:sz w:val="28"/>
+          <w:szCs w:val="28"/>
+        </w:rPr>
+        <w:t>Game does not allow this</w:t>
+      </w:r>
+      <w:r>
+        <w:rPr>
+          <w:sz w:val="28"/>
+          <w:szCs w:val="28"/>
+        </w:rPr>
+        <w:t>, outputs error,</w:t>
+      </w:r>
+      <w:r>
+        <w:rPr>
+          <w:sz w:val="28"/>
+          <w:szCs w:val="28"/>
+        </w:rPr>
+        <w:t xml:space="preserve"> and requests another input</w:t>
+      </w:r>
+    </w:p>
+    <w:p>
+      <w:pPr>
+        <w:pStyle w:val="ListParagraph"/>
+        <w:numPr>
+          <w:ilvl w:val="1"/>
+          <w:numId w:val="4"/>
+        </w:numPr>
+        <w:rPr>
+          <w:sz w:val="28"/>
+          <w:szCs w:val="28"/>
+        </w:rPr>
+      </w:pPr>
+      <w:r>
+        <w:rPr>
+          <w:sz w:val="28"/>
+          <w:szCs w:val="28"/>
+        </w:rPr>
+        <w:t>Observed Behavior: Same as expected behavior</w:t>
+      </w:r>
+    </w:p>
+    <w:p>
+      <w:pPr>
+        <w:pStyle w:val="ListParagraph"/>
+        <w:numPr>
+          <w:ilvl w:val="0"/>
+          <w:numId w:val="4"/>
+        </w:numPr>
+        <w:rPr>
+          <w:sz w:val="28"/>
+          <w:szCs w:val="28"/>
+        </w:rPr>
+      </w:pPr>
+      <w:r>
+        <w:rPr>
+          <w:sz w:val="28"/>
+          <w:szCs w:val="28"/>
+        </w:rPr>
+        <w:t>In</w:t>
+      </w:r>
+      <w:r>
+        <w:rPr>
+          <w:sz w:val="28"/>
+          <w:szCs w:val="28"/>
+        </w:rPr>
+        <w:t xml:space="preserve">valid column </w:t>
+      </w:r>
+      <w:r>
+        <w:rPr>
+          <w:sz w:val="28"/>
+          <w:szCs w:val="28"/>
+        </w:rPr>
+        <w:t>letter</w:t>
+      </w:r>
+    </w:p>
+    <w:p>
+      <w:pPr>
+        <w:pStyle w:val="ListParagraph"/>
+        <w:numPr>
+          <w:ilvl w:val="1"/>
+          <w:numId w:val="4"/>
+        </w:numPr>
+        <w:rPr>
+          <w:sz w:val="28"/>
+          <w:szCs w:val="28"/>
+        </w:rPr>
+      </w:pPr>
+      <w:r>
+        <w:rPr>
+          <w:sz w:val="28"/>
+          <w:szCs w:val="28"/>
+        </w:rPr>
+        <w:t>Game does not allow this</w:t>
+      </w:r>
+      <w:r>
+        <w:rPr>
+          <w:sz w:val="28"/>
+          <w:szCs w:val="28"/>
+        </w:rPr>
+        <w:t xml:space="preserve">, outputs error, </w:t>
+      </w:r>
+      <w:r>
+        <w:rPr>
+          <w:sz w:val="28"/>
+          <w:szCs w:val="28"/>
+        </w:rPr>
+        <w:t>and requests another input</w:t>
+      </w:r>
+    </w:p>
+    <w:p>
+      <w:pPr>
+        <w:pStyle w:val="ListParagraph"/>
+        <w:numPr>
+          <w:ilvl w:val="1"/>
+          <w:numId w:val="4"/>
+        </w:numPr>
+        <w:rPr>
+          <w:sz w:val="28"/>
+          <w:szCs w:val="28"/>
+        </w:rPr>
+      </w:pPr>
+      <w:r>
+        <w:rPr>
+          <w:sz w:val="28"/>
+          <w:szCs w:val="28"/>
+        </w:rPr>
+        <w:t>Observed Behavior: Same as expected behavior</w:t>
+      </w:r>
+    </w:p>
+    <w:p>
+      <w:pPr>
+        <w:pStyle w:val="ListParagraph"/>
+        <w:numPr>
+          <w:ilvl w:val="0"/>
+          <w:numId w:val="4"/>
+        </w:numPr>
+        <w:rPr>
+          <w:sz w:val="28"/>
+          <w:szCs w:val="28"/>
+        </w:rPr>
+      </w:pPr>
+      <w:r>
+        <w:rPr>
+          <w:sz w:val="28"/>
+          <w:szCs w:val="28"/>
+        </w:rPr>
+        <w:t>Invalid row number</w:t>
+      </w:r>
+    </w:p>
+    <w:p>
+      <w:pPr>
+        <w:pStyle w:val="ListParagraph"/>
+        <w:numPr>
+          <w:ilvl w:val="1"/>
+          <w:numId w:val="4"/>
+        </w:numPr>
+        <w:rPr>
+          <w:sz w:val="28"/>
+          <w:szCs w:val="28"/>
+        </w:rPr>
+      </w:pPr>
+      <w:r>
+        <w:rPr>
+          <w:sz w:val="28"/>
+          <w:szCs w:val="28"/>
+        </w:rPr>
+        <w:t>Game does not allow this</w:t>
+      </w:r>
+      <w:r>
+        <w:rPr>
+          <w:sz w:val="28"/>
+          <w:szCs w:val="28"/>
+        </w:rPr>
+        <w:t xml:space="preserve">, outputs error, </w:t>
+      </w:r>
+      <w:r>
+        <w:rPr>
+          <w:sz w:val="28"/>
+          <w:szCs w:val="28"/>
+        </w:rPr>
+        <w:t>and requests another input</w:t>
+      </w:r>
+    </w:p>
+    <w:p>
+      <w:pPr>
+        <w:pStyle w:val="ListParagraph"/>
+        <w:numPr>
+          <w:ilvl w:val="1"/>
+          <w:numId w:val="4"/>
+        </w:numPr>
+        <w:rPr>
+          <w:sz w:val="28"/>
+          <w:szCs w:val="28"/>
+        </w:rPr>
+      </w:pPr>
+      <w:r>
+        <w:rPr>
+          <w:sz w:val="28"/>
+          <w:szCs w:val="28"/>
+        </w:rPr>
+        <w:t xml:space="preserve">Observed Behavior: </w:t>
+      </w:r>
+      <w:r>
+        <w:rPr>
+          <w:sz w:val="28"/>
+          <w:szCs w:val="28"/>
+        </w:rPr>
+        <w:t>Same as expected behavior</w:t>
+      </w:r>
+    </w:p>
+    <w:p>
+      <w:pPr>
+        <w:pStyle w:val="ListParagraph"/>
+        <w:numPr>
+          <w:ilvl w:val="0"/>
+          <w:numId w:val="4"/>
+        </w:numPr>
+        <w:rPr>
+          <w:sz w:val="28"/>
+          <w:szCs w:val="28"/>
+        </w:rPr>
+      </w:pPr>
+      <w:r>
+        <w:rPr>
+          <w:sz w:val="28"/>
+          <w:szCs w:val="28"/>
+        </w:rPr>
+        <w:t>Row and column order swapped (ex: 1A instead of A1)</w:t>
+      </w:r>
+    </w:p>
+    <w:p>
+      <w:pPr>
+        <w:pStyle w:val="ListParagraph"/>
+        <w:numPr>
+          <w:ilvl w:val="1"/>
+          <w:numId w:val="4"/>
+        </w:numPr>
+        <w:rPr>
+          <w:sz w:val="28"/>
+          <w:szCs w:val="28"/>
+        </w:rPr>
+      </w:pPr>
+      <w:r>
+        <w:rPr>
+          <w:sz w:val="28"/>
+          <w:szCs w:val="28"/>
+        </w:rPr>
+        <w:t>Game does not allow this</w:t>
+      </w:r>
+      <w:r>
+        <w:rPr>
+          <w:sz w:val="28"/>
+          <w:szCs w:val="28"/>
+        </w:rPr>
+        <w:t xml:space="preserve">, outputs error, </w:t>
+      </w:r>
+      <w:r>
+        <w:rPr>
+          <w:sz w:val="28"/>
+          <w:szCs w:val="28"/>
+        </w:rPr>
+        <w:t>and requests another input</w:t>
+      </w:r>
+    </w:p>
+    <w:p>
+      <w:pPr>
+        <w:pStyle w:val="ListParagraph"/>
+        <w:numPr>
+          <w:ilvl w:val="1"/>
+          <w:numId w:val="4"/>
+        </w:numPr>
+        <w:rPr>
+          <w:sz w:val="28"/>
+          <w:szCs w:val="28"/>
+        </w:rPr>
+      </w:pPr>
+      <w:r>
+        <w:rPr>
+          <w:sz w:val="28"/>
+          <w:szCs w:val="28"/>
+        </w:rPr>
+        <w:t xml:space="preserve">Observed Behavior: </w:t>
+      </w:r>
+      <w:r>
+        <w:rPr>
+          <w:sz w:val="28"/>
+          <w:szCs w:val="28"/>
+        </w:rPr>
+        <w:t>Same as expected behavior</w:t>
+      </w:r>
+    </w:p>
+    <w:p>
+      <w:pPr>
+        <w:pStyle w:val="ListParagraph"/>
+        <w:numPr>
+          <w:ilvl w:val="0"/>
+          <w:numId w:val="4"/>
+        </w:numPr>
+        <w:rPr>
+          <w:sz w:val="28"/>
+          <w:szCs w:val="28"/>
+        </w:rPr>
+      </w:pPr>
+      <w:r>
+        <w:rPr>
+          <w:sz w:val="28"/>
+          <w:szCs w:val="28"/>
+        </w:rPr>
+        <w:t>Invalid click mode</w:t>
+      </w:r>
+    </w:p>
+    <w:p>
+      <w:pPr>
+        <w:pStyle w:val="ListParagraph"/>
+        <w:numPr>
+          <w:ilvl w:val="1"/>
+          <w:numId w:val="4"/>
+        </w:numPr>
+        <w:rPr>
+          <w:sz w:val="28"/>
+          <w:szCs w:val="28"/>
+        </w:rPr>
+      </w:pPr>
+      <w:r>
+        <w:rPr>
+          <w:sz w:val="28"/>
+          <w:szCs w:val="28"/>
+        </w:rPr>
+        <w:t>Game does not allow this</w:t>
+      </w:r>
+      <w:r>
+        <w:rPr>
+          <w:sz w:val="28"/>
+          <w:szCs w:val="28"/>
+        </w:rPr>
+        <w:t xml:space="preserve">, outputs error, </w:t>
+      </w:r>
+      <w:r>
+        <w:rPr>
+          <w:sz w:val="28"/>
+          <w:szCs w:val="28"/>
+        </w:rPr>
+        <w:t>and requests another input</w:t>
+      </w:r>
+    </w:p>
+    <w:p>
+      <w:pPr>
+        <w:pStyle w:val="ListParagraph"/>
+        <w:numPr>
+          <w:ilvl w:val="1"/>
+          <w:numId w:val="4"/>
+        </w:numPr>
+        <w:rPr>
+          <w:sz w:val="28"/>
+          <w:szCs w:val="28"/>
+        </w:rPr>
+      </w:pPr>
+      <w:r>
+        <w:rPr>
+          <w:sz w:val="28"/>
+          <w:szCs w:val="28"/>
+        </w:rPr>
+        <w:t xml:space="preserve">Observed Behavior: </w:t>
+      </w:r>
+      <w:r>
+        <w:rPr>
+          <w:sz w:val="28"/>
+          <w:szCs w:val="28"/>
+        </w:rPr>
+        <w:t>Same as expected behavior</w:t>
       </w:r>
     </w:p>
     <w:p>

</xml_diff>